<commit_message>
Nút chuyển EN / Tiếng Việt cho prompt, dịch toàn bộ prompt Module 15–16 (chỉ cập nhật bài chưa bị sửa)
Co-Authored-By: Claude Opus 5.5 <noreply@anthropic.com>
</commit_message>
<xml_diff>
--- a/src/db/seed-data/docs/module15-prompt-affiliate.docx
+++ b/src/db/seed-data/docs/module15-prompt-affiliate.docx
@@ -172,7 +172,7 @@
           <w:color w:val="6B7280"/>
           <w:sz w:val="20"/>
         </w:rPr>
-        <w:t xml:space="preserve">Thay các phần [trong ngoặc vuông] bằng thông tin của bạn.</w:t>
+        <w:t xml:space="preserve">Thay các phần [trong ngoặc vuông] bằng thông tin của bạn. Khi dán vào công cụ AI nên dùng bản tiếng Anh (EN); bản dịch tiếng Việt giúp hiểu nội dung.</w:t>
       </w:r>
     </w:p>
     <w:p>
@@ -329,6 +329,19 @@
     </w:p>
     <w:p>
       <w:pPr>
+        <w:spacing w:before="0" w:after="40"/>
+      </w:pPr>
+      <w:r>
+        <w:rPr>
+          <w:b/>
+          <w:color w:val="6B7280"/>
+          <w:sz w:val="18"/>
+        </w:rPr>
+        <w:t xml:space="preserve">EN – Prompt gốc</w:t>
+      </w:r>
+    </w:p>
+    <w:p>
+      <w:pPr>
         <w:spacing w:before="0" w:after="0"/>
         <w:shd w:val="clear" w:color="auto" w:fill="F3F4F6"/>
         <w:ind w:left="200" w:right="200"/>
@@ -381,6 +394,71 @@
           <w:sz w:val="21"/>
         </w:rPr>
         <w:t xml:space="preserve">Audio: satisfying ASMR unboxing sounds: tape peeling, paper rustling. No voice, no music, no text.</w:t>
+      </w:r>
+    </w:p>
+    <w:p>
+      <w:pPr>
+        <w:spacing w:before="120" w:after="40"/>
+      </w:pPr>
+      <w:r>
+        <w:rPr>
+          <w:b/>
+          <w:color w:val="047857"/>
+          <w:sz w:val="18"/>
+        </w:rPr>
+        <w:t xml:space="preserve">VI – Bản dịch tiếng Việt</w:t>
+      </w:r>
+    </w:p>
+    <w:p>
+      <w:pPr>
+        <w:spacing w:before="0" w:after="0"/>
+        <w:shd w:val="clear" w:color="auto" w:fill="ECFDF5"/>
+        <w:ind w:left="200" w:right="200"/>
+      </w:pPr>
+      <w:r>
+        <w:rPr>
+          <w:sz w:val="21"/>
+        </w:rPr>
+        <w:t xml:space="preserve">Cảnh POV từ trên xuống: hai bàn tay đang mở hộp [sản phẩm] trên [bề mặt: bàn làm việc trắng sạch sẽ cạnh laptop và chậu cây nhỏ]. Đôi tay từ từ bóc băng keo, mở hộp, lấy giấy lót ra và nâng sản phẩm về phía máy quay, xoay để khoe chi tiết.</w:t>
+      </w:r>
+    </w:p>
+    <w:p>
+      <w:pPr>
+        <w:spacing w:before="0" w:after="0"/>
+        <w:shd w:val="clear" w:color="auto" w:fill="ECFDF5"/>
+        <w:ind w:left="200" w:right="200"/>
+      </w:pPr>
+      <w:r>
+        <w:rPr>
+          <w:sz w:val="21"/>
+        </w:rPr>
+        <w:t xml:space="preserve">Ánh sáng: ánh sáng ban ngày sáng mềm, thẩm mỹ sạch sẽ.</w:t>
+      </w:r>
+    </w:p>
+    <w:p>
+      <w:pPr>
+        <w:spacing w:before="0" w:after="0"/>
+        <w:shd w:val="clear" w:color="auto" w:fill="ECFDF5"/>
+        <w:ind w:left="200" w:right="200"/>
+      </w:pPr>
+      <w:r>
+        <w:rPr>
+          <w:sz w:val="21"/>
+        </w:rPr>
+        <w:t xml:space="preserve">Máy quay: đứng yên từ trên cao, sau đó nghiêng nhẹ để hé lộ sản phẩm.</w:t>
+      </w:r>
+    </w:p>
+    <w:p>
+      <w:pPr>
+        <w:spacing w:before="0" w:after="0"/>
+        <w:shd w:val="clear" w:color="auto" w:fill="ECFDF5"/>
+        <w:ind w:left="200" w:right="200"/>
+      </w:pPr>
+      <w:r>
+        <w:rPr>
+          <w:sz w:val="21"/>
+        </w:rPr>
+        <w:t xml:space="preserve">Âm thanh: tiếng ASMR mở hộp đã tai: bóc băng keo, sột soạt giấy. Không giọng nói, không nhạc, không chữ.</w:t>
       </w:r>
     </w:p>
     <w:p>
@@ -398,6 +476,19 @@
     </w:p>
     <w:p>
       <w:pPr>
+        <w:spacing w:before="0" w:after="40"/>
+      </w:pPr>
+      <w:r>
+        <w:rPr>
+          <w:b/>
+          <w:color w:val="6B7280"/>
+          <w:sz w:val="18"/>
+        </w:rPr>
+        <w:t xml:space="preserve">EN – Prompt gốc</w:t>
+      </w:r>
+    </w:p>
+    <w:p>
+      <w:pPr>
         <w:spacing w:before="0" w:after="0"/>
         <w:shd w:val="clear" w:color="auto" w:fill="F3F4F6"/>
         <w:ind w:left="200" w:right="200"/>
@@ -464,6 +555,84 @@
           <w:sz w:val="21"/>
         </w:rPr>
         <w:t xml:space="preserve">Audio: clear voice, quiet room. No music, no subtitles.</w:t>
+      </w:r>
+    </w:p>
+    <w:p>
+      <w:pPr>
+        <w:spacing w:before="120" w:after="40"/>
+      </w:pPr>
+      <w:r>
+        <w:rPr>
+          <w:b/>
+          <w:color w:val="047857"/>
+          <w:sz w:val="18"/>
+        </w:rPr>
+        <w:t xml:space="preserve">VI – Bản dịch tiếng Việt</w:t>
+      </w:r>
+    </w:p>
+    <w:p>
+      <w:pPr>
+        <w:spacing w:before="0" w:after="0"/>
+        <w:shd w:val="clear" w:color="auto" w:fill="ECFDF5"/>
+        <w:ind w:left="200" w:right="200"/>
+      </w:pPr>
+      <w:r>
+        <w:rPr>
+          <w:sz w:val="21"/>
+        </w:rPr>
+        <w:t xml:space="preserve">Video selfie dọc: một [nhân vật: phụ nữ Việt Nam ngoài 30, mặc đồ ở nhà giản dị] ngồi trên sofa trong phòng khách ấm cúng, giơ [sản phẩm] lên trước máy quay.</w:t>
+      </w:r>
+    </w:p>
+    <w:p>
+      <w:pPr>
+        <w:spacing w:before="0" w:after="0"/>
+        <w:shd w:val="clear" w:color="auto" w:fill="ECFDF5"/>
+        <w:ind w:left="200" w:right="200"/>
+      </w:pPr>
+      <w:r>
+        <w:rPr>
+          <w:sz w:val="21"/>
+        </w:rPr>
+        <w:t xml:space="preserve">Cô nói bằng tiếng Việt với giọng tự nhiên, chân thật: "[câu thoại: Mua thử con máy này 299 nghìn mà xài sướng thật, để mình chỉ các bạn nha.]"</w:t>
+      </w:r>
+    </w:p>
+    <w:p>
+      <w:pPr>
+        <w:spacing w:before="0" w:after="0"/>
+        <w:shd w:val="clear" w:color="auto" w:fill="ECFDF5"/>
+        <w:ind w:left="200" w:right="200"/>
+      </w:pPr>
+      <w:r>
+        <w:rPr>
+          <w:sz w:val="21"/>
+        </w:rPr>
+        <w:t xml:space="preserve">Máy quay: camera trước điện thoại, cầm tay, chuyển động nhẹ.</w:t>
+      </w:r>
+    </w:p>
+    <w:p>
+      <w:pPr>
+        <w:spacing w:before="0" w:after="0"/>
+        <w:shd w:val="clear" w:color="auto" w:fill="ECFDF5"/>
+        <w:ind w:left="200" w:right="200"/>
+      </w:pPr>
+      <w:r>
+        <w:rPr>
+          <w:sz w:val="21"/>
+        </w:rPr>
+        <w:t xml:space="preserve">Ánh sáng: ánh sáng cửa sổ tự nhiên, không khí gia đình ấm áp.</w:t>
+      </w:r>
+    </w:p>
+    <w:p>
+      <w:pPr>
+        <w:spacing w:before="0" w:after="0"/>
+        <w:shd w:val="clear" w:color="auto" w:fill="ECFDF5"/>
+        <w:ind w:left="200" w:right="200"/>
+      </w:pPr>
+      <w:r>
+        <w:rPr>
+          <w:sz w:val="21"/>
+        </w:rPr>
+        <w:t xml:space="preserve">Âm thanh: giọng rõ, phòng yên tĩnh. Không nhạc, không phụ đề.</w:t>
       </w:r>
     </w:p>
     <w:p>
@@ -481,6 +650,19 @@
     </w:p>
     <w:p>
       <w:pPr>
+        <w:spacing w:before="0" w:after="40"/>
+      </w:pPr>
+      <w:r>
+        <w:rPr>
+          <w:b/>
+          <w:color w:val="6B7280"/>
+          <w:sz w:val="18"/>
+        </w:rPr>
+        <w:t xml:space="preserve">EN – Prompt gốc</w:t>
+      </w:r>
+    </w:p>
+    <w:p>
+      <w:pPr>
         <w:spacing w:before="0" w:after="0"/>
         <w:shd w:val="clear" w:color="auto" w:fill="F3F4F6"/>
         <w:ind w:left="200" w:right="200"/>
@@ -533,6 +715,71 @@
           <w:sz w:val="21"/>
         </w:rPr>
         <w:t xml:space="preserve">Audio: realistic vacuum sound, satisfying. No text on screen.</w:t>
+      </w:r>
+    </w:p>
+    <w:p>
+      <w:pPr>
+        <w:spacing w:before="120" w:after="40"/>
+      </w:pPr>
+      <w:r>
+        <w:rPr>
+          <w:b/>
+          <w:color w:val="047857"/>
+          <w:sz w:val="18"/>
+        </w:rPr>
+        <w:t xml:space="preserve">VI – Bản dịch tiếng Việt</w:t>
+      </w:r>
+    </w:p>
+    <w:p>
+      <w:pPr>
+        <w:spacing w:before="0" w:after="0"/>
+        <w:shd w:val="clear" w:color="auto" w:fill="ECFDF5"/>
+        <w:ind w:left="200" w:right="200"/>
+      </w:pPr>
+      <w:r>
+        <w:rPr>
+          <w:sz w:val="21"/>
+        </w:rPr>
+        <w:t xml:space="preserve">Cận cảnh trình diễn [sản phẩm: máy hút bụi cầm tay mini] [hành động: hút sạch vụn bánh quy trên ghế sofa tối màu chỉ trong một lượt], vùng bẩn trở nên sạch hoàn toàn.</w:t>
+      </w:r>
+    </w:p>
+    <w:p>
+      <w:pPr>
+        <w:spacing w:before="0" w:after="0"/>
+        <w:shd w:val="clear" w:color="auto" w:fill="ECFDF5"/>
+        <w:ind w:left="200" w:right="200"/>
+      </w:pPr>
+      <w:r>
+        <w:rPr>
+          <w:sz w:val="21"/>
+        </w:rPr>
+        <w:t xml:space="preserve">Máy quay: cận cảnh, đứng yên, sau đó tiến chậm vào kết quả sạch sẽ.</w:t>
+      </w:r>
+    </w:p>
+    <w:p>
+      <w:pPr>
+        <w:spacing w:before="0" w:after="0"/>
+        <w:shd w:val="clear" w:color="auto" w:fill="ECFDF5"/>
+        <w:ind w:left="200" w:right="200"/>
+      </w:pPr>
+      <w:r>
+        <w:rPr>
+          <w:sz w:val="21"/>
+        </w:rPr>
+        <w:t xml:space="preserve">Ánh sáng: ánh sáng tự nhiên sáng, bối cảnh gia đình chân thực.</w:t>
+      </w:r>
+    </w:p>
+    <w:p>
+      <w:pPr>
+        <w:spacing w:before="0" w:after="0"/>
+        <w:shd w:val="clear" w:color="auto" w:fill="ECFDF5"/>
+        <w:ind w:left="200" w:right="200"/>
+      </w:pPr>
+      <w:r>
+        <w:rPr>
+          <w:sz w:val="21"/>
+        </w:rPr>
+        <w:t xml:space="preserve">Âm thanh: tiếng máy hút bụi thật, đã tai. Không chữ trên màn hình.</w:t>
       </w:r>
     </w:p>
     <w:p>
@@ -550,6 +797,19 @@
     </w:p>
     <w:p>
       <w:pPr>
+        <w:spacing w:before="0" w:after="40"/>
+      </w:pPr>
+      <w:r>
+        <w:rPr>
+          <w:b/>
+          <w:color w:val="6B7280"/>
+          <w:sz w:val="18"/>
+        </w:rPr>
+        <w:t xml:space="preserve">EN – Prompt gốc</w:t>
+      </w:r>
+    </w:p>
+    <w:p>
+      <w:pPr>
         <w:spacing w:before="0" w:after="0"/>
         <w:shd w:val="clear" w:color="auto" w:fill="F3F4F6"/>
         <w:ind w:left="200" w:right="200"/>
@@ -602,6 +862,71 @@
           <w:sz w:val="21"/>
         </w:rPr>
         <w:t xml:space="preserve">Audio: squishing sound on the left, clean slicing sound on the right. No text.</w:t>
+      </w:r>
+    </w:p>
+    <w:p>
+      <w:pPr>
+        <w:spacing w:before="120" w:after="40"/>
+      </w:pPr>
+      <w:r>
+        <w:rPr>
+          <w:b/>
+          <w:color w:val="047857"/>
+          <w:sz w:val="18"/>
+        </w:rPr>
+        <w:t xml:space="preserve">VI – Bản dịch tiếng Việt</w:t>
+      </w:r>
+    </w:p>
+    <w:p>
+      <w:pPr>
+        <w:spacing w:before="0" w:after="0"/>
+        <w:shd w:val="clear" w:color="auto" w:fill="ECFDF5"/>
+        <w:ind w:left="200" w:right="200"/>
+      </w:pPr>
+      <w:r>
+        <w:rPr>
+          <w:sz w:val="21"/>
+        </w:rPr>
+        <w:t xml:space="preserve">Cảnh kiểu chia đôi màn hình: bên trái [sản phẩm A: con dao bếp thường khó khăn khi cắt quả cà chua], bên phải [sản phẩm B: con dao gốm mới cắt quả cà chua ngọt lịm chỉ trong một đường].</w:t>
+      </w:r>
+    </w:p>
+    <w:p>
+      <w:pPr>
+        <w:spacing w:before="0" w:after="0"/>
+        <w:shd w:val="clear" w:color="auto" w:fill="ECFDF5"/>
+        <w:ind w:left="200" w:right="200"/>
+      </w:pPr>
+      <w:r>
+        <w:rPr>
+          <w:sz w:val="21"/>
+        </w:rPr>
+        <w:t xml:space="preserve">Máy quay: khung cận cảnh đứng yên giống hệt nhau ở hai bên.</w:t>
+      </w:r>
+    </w:p>
+    <w:p>
+      <w:pPr>
+        <w:spacing w:before="0" w:after="0"/>
+        <w:shd w:val="clear" w:color="auto" w:fill="ECFDF5"/>
+        <w:ind w:left="200" w:right="200"/>
+      </w:pPr>
+      <w:r>
+        <w:rPr>
+          <w:sz w:val="21"/>
+        </w:rPr>
+        <w:t xml:space="preserve">Ánh sáng: ánh sáng bếp sáng sủa.</w:t>
+      </w:r>
+    </w:p>
+    <w:p>
+      <w:pPr>
+        <w:spacing w:before="0" w:after="0"/>
+        <w:shd w:val="clear" w:color="auto" w:fill="ECFDF5"/>
+        <w:ind w:left="200" w:right="200"/>
+      </w:pPr>
+      <w:r>
+        <w:rPr>
+          <w:sz w:val="21"/>
+        </w:rPr>
+        <w:t xml:space="preserve">Âm thanh: tiếng bẹp bên trái, tiếng cắt ngọt bên phải. Không chữ.</w:t>
       </w:r>
     </w:p>
     <w:p>
@@ -674,6 +999,19 @@
     </w:p>
     <w:p>
       <w:pPr>
+        <w:spacing w:before="0" w:after="40"/>
+      </w:pPr>
+      <w:r>
+        <w:rPr>
+          <w:b/>
+          <w:color w:val="6B7280"/>
+          <w:sz w:val="18"/>
+        </w:rPr>
+        <w:t xml:space="preserve">EN – Prompt gốc</w:t>
+      </w:r>
+    </w:p>
+    <w:p>
+      <w:pPr>
         <w:spacing w:before="0" w:after="0"/>
         <w:shd w:val="clear" w:color="auto" w:fill="F3F4F6"/>
         <w:ind w:left="200" w:right="200"/>
@@ -740,6 +1078,84 @@
           <w:sz w:val="21"/>
         </w:rPr>
         <w:t xml:space="preserve">Audio: light laughter, kitchen ambience, soft acoustic music.</w:t>
+      </w:r>
+    </w:p>
+    <w:p>
+      <w:pPr>
+        <w:spacing w:before="120" w:after="40"/>
+      </w:pPr>
+      <w:r>
+        <w:rPr>
+          <w:b/>
+          <w:color w:val="047857"/>
+          <w:sz w:val="18"/>
+        </w:rPr>
+        <w:t xml:space="preserve">VI – Bản dịch tiếng Việt</w:t>
+      </w:r>
+    </w:p>
+    <w:p>
+      <w:pPr>
+        <w:spacing w:before="0" w:after="0"/>
+        <w:shd w:val="clear" w:color="auto" w:fill="ECFDF5"/>
+        <w:ind w:left="200" w:right="200"/>
+      </w:pPr>
+      <w:r>
+        <w:rPr>
+          <w:sz w:val="21"/>
+        </w:rPr>
+        <w:t xml:space="preserve">Cảnh lifestyle một cặp đôi trẻ Việt Nam cùng dùng [sản phẩm] trong [bối cảnh: căn bếp nhỏ sáng sủa của căn hộ], cười đùa, sản phẩm khiến công việc trở nên dễ dàng và vui vẻ.</w:t>
+      </w:r>
+    </w:p>
+    <w:p>
+      <w:pPr>
+        <w:spacing w:before="0" w:after="0"/>
+        <w:shd w:val="clear" w:color="auto" w:fill="ECFDF5"/>
+        <w:ind w:left="200" w:right="200"/>
+      </w:pPr>
+      <w:r>
+        <w:rPr>
+          <w:sz w:val="21"/>
+        </w:rPr>
+        <w:t xml:space="preserve">Máy quay: trung cảnh, cầm tay chuyển động chậm, cảm giác tự nhiên.</w:t>
+      </w:r>
+    </w:p>
+    <w:p>
+      <w:pPr>
+        <w:spacing w:before="0" w:after="0"/>
+        <w:shd w:val="clear" w:color="auto" w:fill="ECFDF5"/>
+        <w:ind w:left="200" w:right="200"/>
+      </w:pPr>
+      <w:r>
+        <w:rPr>
+          <w:sz w:val="21"/>
+        </w:rPr>
+        <w:t xml:space="preserve">Ánh sáng: nắng sớm ấm áp.</w:t>
+      </w:r>
+    </w:p>
+    <w:p>
+      <w:pPr>
+        <w:spacing w:before="0" w:after="0"/>
+        <w:shd w:val="clear" w:color="auto" w:fill="ECFDF5"/>
+        <w:ind w:left="200" w:right="200"/>
+      </w:pPr>
+      <w:r>
+        <w:rPr>
+          <w:sz w:val="21"/>
+        </w:rPr>
+        <w:t xml:space="preserve">Phong cách: quảng cáo lifestyle chân thực, không quá bóng bẩy.</w:t>
+      </w:r>
+    </w:p>
+    <w:p>
+      <w:pPr>
+        <w:spacing w:before="0" w:after="0"/>
+        <w:shd w:val="clear" w:color="auto" w:fill="ECFDF5"/>
+        <w:ind w:left="200" w:right="200"/>
+      </w:pPr>
+      <w:r>
+        <w:rPr>
+          <w:sz w:val="21"/>
+        </w:rPr>
+        <w:t xml:space="preserve">Âm thanh: tiếng cười nhẹ, tiếng bếp, nhạc acoustic nhẹ nhàng.</w:t>
       </w:r>
     </w:p>
     <w:sectPr>

</xml_diff>